<commit_message>
Cap nhat lai noi dung test case tuan 1
</commit_message>
<xml_diff>
--- a/docs/test-cases/TestCase_Tuan1_DangKi.docx
+++ b/docs/test-cases/TestCase_Tuan1_DangKi.docx
@@ -10,6 +10,10 @@
     <w:p/>
     <w:p>
       <w:r>
+        <w:rPr>
+          <w:noProof/>
+          <w:lang w:eastAsia="vi-VN"/>
+        </w:rPr>
         <w:drawing>
           <wp:inline distT="0" distB="0" distL="0" distR="0" wp14:anchorId="05198AAC" wp14:editId="53167293">
             <wp:extent cx="5731510" cy="3236595"/>
@@ -69,6 +73,17 @@
     </w:p>
     <w:p>
       <w:r>
+        <w:rPr>
+          <w:lang w:val="en-US"/>
+        </w:rPr>
+        <w:t>***</w:t>
+      </w:r>
+      <w:r>
+        <w:t>Chiến***</w:t>
+      </w:r>
+    </w:p>
+    <w:p>
+      <w:r>
         <w:t>+ Khi xuất hiện lỗi, nên báo rõ lỗi xuất hiện ở chỗ nào, hoặc đơn giản hơn là có thể check được cái điều kiện tối thiểu như ở chỗ “Mật khẩu” (3 ô chữ xanh lá)</w:t>
       </w:r>
     </w:p>
@@ -79,15 +94,25 @@
     </w:p>
     <w:p>
       <w:r>
-        <w:t>- Kết quả mong đợi;</w:t>
-      </w:r>
-    </w:p>
-    <w:p>
-      <w:r>
-        <w:t>+ Có thể dễ dàng nhận ra lỗi khiến người dùng không thể đăng kí tài khoản mới.</w:t>
+        <w:t>***Tỷ***</w:t>
+      </w:r>
+    </w:p>
+    <w:p>
+      <w:r>
+        <w:t>+ Tối ưu code frontend của giao diện đăng nhập loại bỏ code thừa ghi chú...</w:t>
       </w:r>
       <w:bookmarkStart w:id="0" w:name="_GoBack"/>
       <w:bookmarkEnd w:id="0"/>
+    </w:p>
+    <w:p>
+      <w:r>
+        <w:t>- Kết quả mong đợi;</w:t>
+      </w:r>
+    </w:p>
+    <w:p>
+      <w:r>
+        <w:t>+ Có thể dễ dàng nhận ra lỗi khiến người dùng không thể đăng kí tài khoản mới.</w:t>
+      </w:r>
     </w:p>
     <w:sectPr>
       <w:pgSz w:w="11906" w:h="16838"/>

</xml_diff>